<commit_message>
Refine wizard, fixed age eligibility, warnings and investigator document formatting
</commit_message>
<xml_diff>
--- a/public/document-base.docx
+++ b/public/document-base.docx
@@ -101,56 +101,75 @@
           </w:pPr>
           <w:r>
             <w:rPr>
-              <w:rFonts w:ascii="Arial" w:eastAsia="Arial" w:hAnsi="Arial" w:cs="Arial"/>
+              <w:rFonts w:ascii="Arial" w:hAnsi="Arial" w:cs="Arial" w:eastAsia="Arial"/>
               <w:color w:val="000000"/>
+              <w:sz w:val="22"/>
+              <w:szCs w:val="22"/>
             </w:rPr>
             <w:t xml:space="preserve">Page </w:t>
           </w:r>
           <w:r>
             <w:rPr>
-              <w:rFonts w:ascii="Arial" w:eastAsia="Arial" w:hAnsi="Arial" w:cs="Arial"/>
+              <w:rFonts w:ascii="Arial" w:hAnsi="Arial" w:cs="Arial" w:eastAsia="Arial"/>
               <w:color w:val="000000"/>
+              <w:sz w:val="22"/>
+              <w:szCs w:val="22"/>
             </w:rPr>
             <w:fldChar w:fldCharType="begin"/>
           </w:r>
           <w:r>
             <w:rPr>
-              <w:rFonts w:ascii="Arial" w:eastAsia="Arial" w:hAnsi="Arial" w:cs="Arial"/>
+              <w:rFonts w:ascii="Arial" w:hAnsi="Arial" w:cs="Arial" w:eastAsia="Arial"/>
               <w:color w:val="000000"/>
+              <w:sz w:val="22"/>
+              <w:szCs w:val="22"/>
             </w:rPr>
             <w:instrText>PAGE</w:instrText>
           </w:r>
           <w:r>
             <w:rPr>
-              <w:rFonts w:ascii="Arial" w:eastAsia="Arial" w:hAnsi="Arial" w:cs="Arial"/>
+              <w:rFonts w:ascii="Arial" w:hAnsi="Arial" w:cs="Arial" w:eastAsia="Arial"/>
               <w:color w:val="000000"/>
+              <w:sz w:val="22"/>
+              <w:szCs w:val="22"/>
             </w:rPr>
             <w:fldChar w:fldCharType="separate"/>
           </w:r>
           <w:r>
             <w:rPr>
-              <w:rFonts w:ascii="Arial" w:eastAsia="Arial" w:hAnsi="Arial" w:cs="Arial"/>
-              <w:noProof/>
+              <w:rFonts w:ascii="Arial" w:hAnsi="Arial" w:cs="Arial" w:eastAsia="Arial"/>
               <w:color w:val="000000"/>
+              <w:sz w:val="22"/>
+              <w:szCs w:val="22"/>
             </w:rPr>
             <w:t>1</w:t>
           </w:r>
           <w:r>
             <w:rPr>
-              <w:rFonts w:ascii="Arial" w:eastAsia="Arial" w:hAnsi="Arial" w:cs="Arial"/>
+              <w:rFonts w:ascii="Arial" w:hAnsi="Arial" w:cs="Arial" w:eastAsia="Arial"/>
               <w:color w:val="000000"/>
+              <w:sz w:val="22"/>
+              <w:szCs w:val="22"/>
             </w:rPr>
             <w:fldChar w:fldCharType="end"/>
           </w:r>
           <w:r>
             <w:rPr>
-              <w:rFonts w:ascii="Arial" w:eastAsia="Arial" w:hAnsi="Arial" w:cs="Arial"/>
+              <w:rFonts w:ascii="Arial" w:hAnsi="Arial" w:cs="Arial" w:eastAsia="Arial"/>
               <w:color w:val="000000"/>
+              <w:sz w:val="22"/>
+              <w:szCs w:val="22"/>
             </w:rPr>
             <w:t xml:space="preserve"> of </w:t>
           </w:r>
           <w:fldSimple w:instr="NUMPAGES">
             <w:r>
+              <w:rPr>
+                <w:rFonts w:ascii="Arial" w:hAnsi="Arial" w:cs="Arial" w:eastAsia="Arial"/>
+                <w:color w:val="000000"/>
+                <w:sz w:val="22"/>
+                <w:szCs w:val="22"/>
+              </w:rPr>
               <w:t>1</w:t>
             </w:r>
           </w:fldSimple>

</xml_diff>